<commit_message>
Made changes in file handling
</commit_message>
<xml_diff>
--- a/OOP-Course_Project_Report.docx
+++ b/OOP-Course_Project_Report.docx
@@ -482,225 +482,95 @@
       </w:pPr>
       <w:bookmarkStart w:id="0" w:name="_Hlk150292278"/>
     </w:p>
+    <w:bookmarkEnd w:id="0"/>
     <w:p>
       <w:pPr>
         <w:widowControl/>
         <w:jc w:val="center"/>
         <w:rPr>
+          <w:rFonts w:ascii="Times New Roman" w:hAnsi="Times New Roman" w:cs="Times New Roman"/>
+          <w:sz w:val="28"/>
+          <w:szCs w:val="28"/>
+        </w:rPr>
+      </w:pPr>
+      <w:r>
+        <w:rPr>
           <w:rFonts w:ascii="Times New Roman" w:eastAsia="SimSun" w:hAnsi="Times New Roman" w:cs="Times New Roman"/>
           <w:color w:val="000000"/>
-          <w:sz w:val="32"/>
-          <w:szCs w:val="32"/>
+          <w:sz w:val="28"/>
+          <w:szCs w:val="28"/>
           <w:lang w:eastAsia="zh-CN" w:bidi="ar"/>
+        </w:rPr>
+        <w:t>Raghav Mulay (12413749)</w:t>
+      </w:r>
+    </w:p>
+    <w:p>
+      <w:pPr>
+        <w:widowControl/>
+        <w:jc w:val="center"/>
+        <w:rPr>
+          <w:rFonts w:ascii="Times New Roman" w:hAnsi="Times New Roman" w:cs="Times New Roman"/>
+          <w:sz w:val="28"/>
+          <w:szCs w:val="28"/>
         </w:rPr>
       </w:pPr>
       <w:r>
         <w:rPr>
           <w:rFonts w:ascii="Times New Roman" w:eastAsia="SimSun" w:hAnsi="Times New Roman" w:cs="Times New Roman"/>
           <w:color w:val="000000"/>
-          <w:sz w:val="32"/>
-          <w:szCs w:val="32"/>
+          <w:sz w:val="28"/>
+          <w:szCs w:val="28"/>
           <w:lang w:eastAsia="zh-CN" w:bidi="ar"/>
         </w:rPr>
-        <w:t>Yashraj Nagargoje</w:t>
-      </w:r>
-      <w:r>
+        <w:t>Mustafa Nazir (12414013)</w:t>
+      </w:r>
+    </w:p>
+    <w:p>
+      <w:pPr>
+        <w:widowControl/>
+        <w:jc w:val="center"/>
         <w:rPr>
           <w:rFonts w:ascii="Times New Roman" w:eastAsia="SimSun" w:hAnsi="Times New Roman" w:cs="Times New Roman"/>
           <w:color w:val="000000"/>
-          <w:sz w:val="32"/>
-          <w:szCs w:val="32"/>
+          <w:sz w:val="28"/>
+          <w:szCs w:val="28"/>
           <w:lang w:eastAsia="zh-CN" w:bidi="ar"/>
         </w:rPr>
-        <w:t xml:space="preserve"> (</w:t>
-      </w:r>
+      </w:pPr>
       <w:r>
         <w:rPr>
           <w:rFonts w:ascii="Times New Roman" w:eastAsia="SimSun" w:hAnsi="Times New Roman" w:cs="Times New Roman"/>
           <w:color w:val="000000"/>
-          <w:sz w:val="32"/>
-          <w:szCs w:val="32"/>
+          <w:sz w:val="28"/>
+          <w:szCs w:val="28"/>
           <w:lang w:eastAsia="zh-CN" w:bidi="ar"/>
         </w:rPr>
-        <w:t xml:space="preserve"> </w:t>
-      </w:r>
+        <w:t>Yashraj Nagargoje (12414910)</w:t>
+      </w:r>
+    </w:p>
+    <w:p>
+      <w:pPr>
+        <w:widowControl/>
+        <w:jc w:val="center"/>
+        <w:rPr>
+          <w:rFonts w:ascii="Times New Roman" w:hAnsi="Times New Roman" w:cs="Times New Roman"/>
+          <w:b/>
+          <w:color w:val="FF0000"/>
+          <w:sz w:val="28"/>
+          <w:szCs w:val="28"/>
+        </w:rPr>
+      </w:pPr>
       <w:r>
         <w:rPr>
           <w:rFonts w:ascii="Times New Roman" w:eastAsia="SimSun" w:hAnsi="Times New Roman" w:cs="Times New Roman"/>
           <w:color w:val="000000"/>
-          <w:sz w:val="32"/>
-          <w:szCs w:val="32"/>
+          <w:sz w:val="28"/>
+          <w:szCs w:val="28"/>
           <w:lang w:eastAsia="zh-CN" w:bidi="ar"/>
         </w:rPr>
-        <w:t>124</w:t>
-      </w:r>
-      <w:r>
-        <w:rPr>
-          <w:rFonts w:ascii="Times New Roman" w:eastAsia="SimSun" w:hAnsi="Times New Roman" w:cs="Times New Roman"/>
-          <w:color w:val="000000"/>
-          <w:sz w:val="32"/>
-          <w:szCs w:val="32"/>
-          <w:lang w:eastAsia="zh-CN" w:bidi="ar"/>
-        </w:rPr>
-        <w:t>1</w:t>
-      </w:r>
-      <w:r>
-        <w:rPr>
-          <w:rFonts w:ascii="Times New Roman" w:eastAsia="SimSun" w:hAnsi="Times New Roman" w:cs="Times New Roman"/>
-          <w:color w:val="000000"/>
-          <w:sz w:val="32"/>
-          <w:szCs w:val="32"/>
-          <w:lang w:eastAsia="zh-CN" w:bidi="ar"/>
-        </w:rPr>
-        <w:t>4910</w:t>
-      </w:r>
-      <w:r>
-        <w:rPr>
-          <w:rFonts w:ascii="Times New Roman" w:eastAsia="SimSun" w:hAnsi="Times New Roman" w:cs="Times New Roman"/>
-          <w:color w:val="000000"/>
-          <w:sz w:val="32"/>
-          <w:szCs w:val="32"/>
-          <w:lang w:eastAsia="zh-CN" w:bidi="ar"/>
-        </w:rPr>
-        <w:t xml:space="preserve"> )</w:t>
-      </w:r>
-    </w:p>
-    <w:p>
-      <w:pPr>
-        <w:widowControl/>
-        <w:jc w:val="center"/>
-        <w:rPr>
-          <w:rFonts w:ascii="Times New Roman" w:hAnsi="Times New Roman" w:cs="Times New Roman"/>
-          <w:sz w:val="32"/>
-          <w:szCs w:val="32"/>
-        </w:rPr>
-      </w:pPr>
-      <w:r>
-        <w:rPr>
-          <w:rFonts w:ascii="Times New Roman" w:eastAsia="SimSun" w:hAnsi="Times New Roman" w:cs="Times New Roman"/>
-          <w:color w:val="000000"/>
-          <w:sz w:val="32"/>
-          <w:szCs w:val="32"/>
-          <w:lang w:eastAsia="zh-CN" w:bidi="ar"/>
-        </w:rPr>
-        <w:t>Raghav Mul</w:t>
-      </w:r>
-      <w:r>
-        <w:rPr>
-          <w:rFonts w:ascii="Times New Roman" w:eastAsia="SimSun" w:hAnsi="Times New Roman" w:cs="Times New Roman"/>
-          <w:color w:val="000000"/>
-          <w:sz w:val="32"/>
-          <w:szCs w:val="32"/>
-          <w:lang w:eastAsia="zh-CN" w:bidi="ar"/>
-        </w:rPr>
-        <w:t>a</w:t>
-      </w:r>
-      <w:r>
-        <w:rPr>
-          <w:rFonts w:ascii="Times New Roman" w:eastAsia="SimSun" w:hAnsi="Times New Roman" w:cs="Times New Roman"/>
-          <w:color w:val="000000"/>
-          <w:sz w:val="32"/>
-          <w:szCs w:val="32"/>
-          <w:lang w:eastAsia="zh-CN" w:bidi="ar"/>
-        </w:rPr>
-        <w:t>y</w:t>
-      </w:r>
-      <w:r>
-        <w:rPr>
-          <w:rFonts w:ascii="Times New Roman" w:eastAsia="SimSun" w:hAnsi="Times New Roman" w:cs="Times New Roman"/>
-          <w:color w:val="000000"/>
-          <w:sz w:val="32"/>
-          <w:szCs w:val="32"/>
-          <w:lang w:eastAsia="zh-CN" w:bidi="ar"/>
-        </w:rPr>
-        <w:t xml:space="preserve"> (1241</w:t>
-      </w:r>
-      <w:r>
-        <w:rPr>
-          <w:rFonts w:ascii="Times New Roman" w:eastAsia="SimSun" w:hAnsi="Times New Roman" w:cs="Times New Roman"/>
-          <w:color w:val="000000"/>
-          <w:sz w:val="32"/>
-          <w:szCs w:val="32"/>
-          <w:lang w:eastAsia="zh-CN" w:bidi="ar"/>
-        </w:rPr>
-        <w:t>3749</w:t>
-      </w:r>
-      <w:r>
-        <w:rPr>
-          <w:rFonts w:ascii="Times New Roman" w:eastAsia="SimSun" w:hAnsi="Times New Roman" w:cs="Times New Roman"/>
-          <w:color w:val="000000"/>
-          <w:sz w:val="32"/>
-          <w:szCs w:val="32"/>
-          <w:lang w:eastAsia="zh-CN" w:bidi="ar"/>
-        </w:rPr>
-        <w:t>)</w:t>
-      </w:r>
-    </w:p>
-    <w:p>
-      <w:pPr>
-        <w:widowControl/>
-        <w:jc w:val="center"/>
-        <w:rPr>
-          <w:rFonts w:ascii="Times New Roman" w:hAnsi="Times New Roman" w:cs="Times New Roman"/>
-          <w:sz w:val="32"/>
-          <w:szCs w:val="32"/>
-        </w:rPr>
-      </w:pPr>
-      <w:r>
-        <w:rPr>
-          <w:rFonts w:ascii="Times New Roman" w:eastAsia="SimSun" w:hAnsi="Times New Roman" w:cs="Times New Roman"/>
-          <w:color w:val="000000"/>
-          <w:sz w:val="32"/>
-          <w:szCs w:val="32"/>
-          <w:lang w:eastAsia="zh-CN" w:bidi="ar"/>
-        </w:rPr>
-        <w:t>Mustafa Nazir</w:t>
-      </w:r>
-      <w:r>
-        <w:rPr>
-          <w:rFonts w:ascii="Times New Roman" w:eastAsia="SimSun" w:hAnsi="Times New Roman" w:cs="Times New Roman"/>
-          <w:color w:val="000000"/>
-          <w:sz w:val="32"/>
-          <w:szCs w:val="32"/>
-          <w:lang w:eastAsia="zh-CN" w:bidi="ar"/>
-        </w:rPr>
-        <w:t xml:space="preserve"> (124112525)</w:t>
-      </w:r>
-    </w:p>
-    <w:p>
-      <w:pPr>
-        <w:widowControl/>
-        <w:jc w:val="center"/>
-        <w:rPr>
-          <w:rFonts w:ascii="Times New Roman" w:hAnsi="Times New Roman" w:cs="Times New Roman"/>
-          <w:b/>
-          <w:color w:val="FF0000"/>
-          <w:sz w:val="32"/>
-          <w:szCs w:val="32"/>
-        </w:rPr>
-      </w:pPr>
-      <w:r>
-        <w:rPr>
-          <w:rFonts w:ascii="Times New Roman" w:eastAsia="SimSun" w:hAnsi="Times New Roman" w:cs="Times New Roman"/>
-          <w:color w:val="000000"/>
-          <w:sz w:val="32"/>
-          <w:szCs w:val="32"/>
-          <w:lang w:eastAsia="zh-CN" w:bidi="ar"/>
-        </w:rPr>
-        <w:t>Parth Naik</w:t>
-      </w:r>
-      <w:r>
-        <w:rPr>
-          <w:rFonts w:ascii="Times New Roman" w:eastAsia="SimSun" w:hAnsi="Times New Roman" w:cs="Times New Roman"/>
-          <w:color w:val="000000"/>
-          <w:sz w:val="32"/>
-          <w:szCs w:val="32"/>
-          <w:lang w:eastAsia="zh-CN" w:bidi="ar"/>
-        </w:rPr>
-        <w:t xml:space="preserve"> (12412077)</w:t>
-      </w:r>
-    </w:p>
-    <w:bookmarkEnd w:id="0"/>
+        <w:t>Parth Naik (12414737)</w:t>
+      </w:r>
+    </w:p>
     <w:p>
       <w:pPr>
         <w:spacing w:before="277"/>
@@ -1533,6 +1403,7 @@
     <w:p>
       <w:pPr>
         <w:widowControl/>
+        <w:jc w:val="both"/>
         <w:rPr>
           <w:rFonts w:ascii="Times New Roman" w:eastAsia="SimSun" w:hAnsi="Times New Roman" w:cs="Times New Roman"/>
           <w:color w:val="000000"/>
@@ -1591,7 +1462,167 @@
           <w:szCs w:val="28"/>
           <w:lang w:eastAsia="zh-CN" w:bidi="ar"/>
         </w:rPr>
-        <w:t xml:space="preserve">Yashraj Nagargoje (12414910) Raghav Muley (12412144) Mustafa Nazir (124112525) Parth Naik (12412077) </w:t>
+        <w:t>Raghav Mul</w:t>
+      </w:r>
+      <w:r>
+        <w:rPr>
+          <w:rFonts w:ascii="Times New Roman" w:eastAsia="SimSun" w:hAnsi="Times New Roman" w:cs="Times New Roman"/>
+          <w:color w:val="000000"/>
+          <w:sz w:val="28"/>
+          <w:szCs w:val="28"/>
+          <w:lang w:eastAsia="zh-CN" w:bidi="ar"/>
+        </w:rPr>
+        <w:t>a</w:t>
+      </w:r>
+      <w:r>
+        <w:rPr>
+          <w:rFonts w:ascii="Times New Roman" w:eastAsia="SimSun" w:hAnsi="Times New Roman" w:cs="Times New Roman"/>
+          <w:color w:val="000000"/>
+          <w:sz w:val="28"/>
+          <w:szCs w:val="28"/>
+          <w:lang w:eastAsia="zh-CN" w:bidi="ar"/>
+        </w:rPr>
+        <w:t>y (1241</w:t>
+      </w:r>
+      <w:r>
+        <w:rPr>
+          <w:rFonts w:ascii="Times New Roman" w:eastAsia="SimSun" w:hAnsi="Times New Roman" w:cs="Times New Roman"/>
+          <w:color w:val="000000"/>
+          <w:sz w:val="28"/>
+          <w:szCs w:val="28"/>
+          <w:lang w:eastAsia="zh-CN" w:bidi="ar"/>
+        </w:rPr>
+        <w:t>3749</w:t>
+      </w:r>
+      <w:r>
+        <w:rPr>
+          <w:rFonts w:ascii="Times New Roman" w:eastAsia="SimSun" w:hAnsi="Times New Roman" w:cs="Times New Roman"/>
+          <w:color w:val="000000"/>
+          <w:sz w:val="28"/>
+          <w:szCs w:val="28"/>
+          <w:lang w:eastAsia="zh-CN" w:bidi="ar"/>
+        </w:rPr>
+        <w:t>)</w:t>
+      </w:r>
+      <w:r>
+        <w:rPr>
+          <w:rFonts w:ascii="Times New Roman" w:eastAsia="SimSun" w:hAnsi="Times New Roman" w:cs="Times New Roman"/>
+          <w:color w:val="000000"/>
+          <w:sz w:val="28"/>
+          <w:szCs w:val="28"/>
+          <w:lang w:eastAsia="zh-CN" w:bidi="ar"/>
+        </w:rPr>
+        <w:t>,</w:t>
+      </w:r>
+      <w:r>
+        <w:rPr>
+          <w:rFonts w:ascii="Times New Roman" w:eastAsia="SimSun" w:hAnsi="Times New Roman" w:cs="Times New Roman"/>
+          <w:color w:val="000000"/>
+          <w:sz w:val="28"/>
+          <w:szCs w:val="28"/>
+          <w:lang w:eastAsia="zh-CN" w:bidi="ar"/>
+        </w:rPr>
+        <w:t xml:space="preserve"> Mustafa Nazir (</w:t>
+      </w:r>
+      <w:r>
+        <w:rPr>
+          <w:rFonts w:ascii="Times New Roman" w:eastAsia="SimSun" w:hAnsi="Times New Roman" w:cs="Times New Roman"/>
+          <w:color w:val="000000"/>
+          <w:sz w:val="28"/>
+          <w:szCs w:val="28"/>
+          <w:lang w:eastAsia="zh-CN" w:bidi="ar"/>
+        </w:rPr>
+        <w:t>12414013</w:t>
+      </w:r>
+      <w:r>
+        <w:rPr>
+          <w:rFonts w:ascii="Times New Roman" w:eastAsia="SimSun" w:hAnsi="Times New Roman" w:cs="Times New Roman"/>
+          <w:color w:val="000000"/>
+          <w:sz w:val="28"/>
+          <w:szCs w:val="28"/>
+          <w:lang w:eastAsia="zh-CN" w:bidi="ar"/>
+        </w:rPr>
+        <w:t>)</w:t>
+      </w:r>
+      <w:r>
+        <w:rPr>
+          <w:rFonts w:ascii="Times New Roman" w:eastAsia="SimSun" w:hAnsi="Times New Roman" w:cs="Times New Roman"/>
+          <w:color w:val="000000"/>
+          <w:sz w:val="28"/>
+          <w:szCs w:val="28"/>
+          <w:lang w:eastAsia="zh-CN" w:bidi="ar"/>
+        </w:rPr>
+        <w:t xml:space="preserve">, </w:t>
+      </w:r>
+      <w:r>
+        <w:rPr>
+          <w:rFonts w:ascii="Times New Roman" w:eastAsia="SimSun" w:hAnsi="Times New Roman" w:cs="Times New Roman"/>
+          <w:color w:val="000000"/>
+          <w:sz w:val="28"/>
+          <w:szCs w:val="28"/>
+          <w:lang w:eastAsia="zh-CN" w:bidi="ar"/>
+        </w:rPr>
+        <w:t>Yashraj Nagargoje (</w:t>
+      </w:r>
+      <w:r>
+        <w:rPr>
+          <w:rFonts w:ascii="Times New Roman" w:eastAsia="SimSun" w:hAnsi="Times New Roman" w:cs="Times New Roman"/>
+          <w:color w:val="000000"/>
+          <w:sz w:val="28"/>
+          <w:szCs w:val="28"/>
+          <w:lang w:eastAsia="zh-CN" w:bidi="ar"/>
+        </w:rPr>
+        <w:t>12414910</w:t>
+      </w:r>
+      <w:r>
+        <w:rPr>
+          <w:rFonts w:ascii="Times New Roman" w:eastAsia="SimSun" w:hAnsi="Times New Roman" w:cs="Times New Roman"/>
+          <w:color w:val="000000"/>
+          <w:sz w:val="28"/>
+          <w:szCs w:val="28"/>
+          <w:lang w:eastAsia="zh-CN" w:bidi="ar"/>
+        </w:rPr>
+        <w:t>)</w:t>
+      </w:r>
+      <w:r>
+        <w:rPr>
+          <w:rFonts w:ascii="Times New Roman" w:eastAsia="SimSun" w:hAnsi="Times New Roman" w:cs="Times New Roman"/>
+          <w:color w:val="000000"/>
+          <w:sz w:val="28"/>
+          <w:szCs w:val="28"/>
+          <w:lang w:eastAsia="zh-CN" w:bidi="ar"/>
+        </w:rPr>
+        <w:t>,</w:t>
+      </w:r>
+      <w:r>
+        <w:rPr>
+          <w:rFonts w:ascii="Times New Roman" w:eastAsia="SimSun" w:hAnsi="Times New Roman" w:cs="Times New Roman"/>
+          <w:color w:val="000000"/>
+          <w:sz w:val="28"/>
+          <w:szCs w:val="28"/>
+          <w:lang w:eastAsia="zh-CN" w:bidi="ar"/>
+        </w:rPr>
+        <w:t xml:space="preserve"> Parth Naik (</w:t>
+      </w:r>
+      <w:r>
+        <w:rPr>
+          <w:rFonts w:ascii="Times New Roman" w:eastAsia="SimSun" w:hAnsi="Times New Roman" w:cs="Times New Roman"/>
+          <w:color w:val="000000"/>
+          <w:sz w:val="28"/>
+          <w:szCs w:val="28"/>
+          <w:lang w:eastAsia="zh-CN" w:bidi="ar"/>
+        </w:rPr>
+        <w:t>12414737</w:t>
+      </w:r>
+      <w:r>
+        <w:rPr>
+          <w:rFonts w:ascii="Times New Roman" w:eastAsia="SimSun" w:hAnsi="Times New Roman" w:cs="Times New Roman"/>
+          <w:color w:val="000000"/>
+          <w:sz w:val="28"/>
+          <w:szCs w:val="28"/>
+          <w:lang w:eastAsia="zh-CN" w:bidi="ar"/>
+        </w:rPr>
+        <w:t xml:space="preserve">) </w:t>
       </w:r>
       <w:r>
         <w:rPr>
@@ -1640,8 +1671,9 @@
           <w:szCs w:val="28"/>
           <w:lang w:eastAsia="zh-CN" w:bidi="ar"/>
         </w:rPr>
-        <w:t xml:space="preserve">Department Of </w:t>
-      </w:r>
+        <w:t xml:space="preserve">Department </w:t>
+      </w:r>
+      <w:proofErr w:type="gramStart"/>
       <w:r>
         <w:rPr>
           <w:rFonts w:ascii="Times New Roman" w:eastAsia="SimSun" w:hAnsi="Times New Roman" w:cs="Times New Roman"/>
@@ -1652,6 +1684,31 @@
           <w:szCs w:val="28"/>
           <w:lang w:eastAsia="zh-CN" w:bidi="ar"/>
         </w:rPr>
+        <w:t>Of</w:t>
+      </w:r>
+      <w:proofErr w:type="gramEnd"/>
+      <w:r>
+        <w:rPr>
+          <w:rFonts w:ascii="Times New Roman" w:eastAsia="SimSun" w:hAnsi="Times New Roman" w:cs="Times New Roman"/>
+          <w:b/>
+          <w:bCs/>
+          <w:color w:val="FF0000"/>
+          <w:sz w:val="28"/>
+          <w:szCs w:val="28"/>
+          <w:lang w:eastAsia="zh-CN" w:bidi="ar"/>
+        </w:rPr>
+        <w:t xml:space="preserve"> </w:t>
+      </w:r>
+      <w:r>
+        <w:rPr>
+          <w:rFonts w:ascii="Times New Roman" w:eastAsia="SimSun" w:hAnsi="Times New Roman" w:cs="Times New Roman"/>
+          <w:b/>
+          <w:bCs/>
+          <w:color w:val="FF0000"/>
+          <w:sz w:val="28"/>
+          <w:szCs w:val="28"/>
+          <w:lang w:eastAsia="zh-CN" w:bidi="ar"/>
+        </w:rPr>
         <w:t xml:space="preserve">Artificial Intelligence </w:t>
       </w:r>
       <w:r>
@@ -1684,6 +1741,7 @@
         </w:rPr>
         <w:t xml:space="preserve"> </w:t>
       </w:r>
+      <w:proofErr w:type="spellStart"/>
       <w:r>
         <w:rPr>
           <w:rFonts w:ascii="Times New Roman" w:hAnsi="Times New Roman" w:cs="Times New Roman"/>
@@ -1691,6 +1749,7 @@
         </w:rPr>
         <w:t>bonafide</w:t>
       </w:r>
+      <w:proofErr w:type="spellEnd"/>
       <w:r>
         <w:rPr>
           <w:rFonts w:ascii="Times New Roman" w:hAnsi="Times New Roman" w:cs="Times New Roman"/>
@@ -2738,6 +2797,8 @@
             <w:r>
               <w:rPr>
                 <w:rFonts w:ascii="Times New Roman" w:hAnsi="Times New Roman" w:cs="Times New Roman"/>
+                <w:sz w:val="24"/>
+                <w:szCs w:val="24"/>
               </w:rPr>
               <w:t>26</w:t>
             </w:r>
@@ -2762,17 +2823,7 @@
                 <w:szCs w:val="24"/>
                 <w:lang w:eastAsia="zh-CN" w:bidi="ar"/>
               </w:rPr>
-              <w:t>124</w:t>
-            </w:r>
-            <w:r>
-              <w:rPr>
-                <w:rFonts w:ascii="Times New Roman" w:eastAsia="SimSun" w:hAnsi="Times New Roman" w:cs="Times New Roman"/>
-                <w:color w:val="000000"/>
-                <w:sz w:val="24"/>
-                <w:szCs w:val="24"/>
-                <w:lang w:eastAsia="zh-CN" w:bidi="ar"/>
-              </w:rPr>
-              <w:t>12601</w:t>
+              <w:t>12413749</w:t>
             </w:r>
           </w:p>
         </w:tc>
@@ -2797,27 +2848,7 @@
                 <w:szCs w:val="24"/>
                 <w:lang w:eastAsia="zh-CN" w:bidi="ar"/>
               </w:rPr>
-              <w:t>Raghav Mul</w:t>
-            </w:r>
-            <w:r>
-              <w:rPr>
-                <w:rFonts w:ascii="Times New Roman" w:eastAsia="SimSun" w:hAnsi="Times New Roman" w:cs="Times New Roman"/>
-                <w:color w:val="000000"/>
-                <w:sz w:val="24"/>
-                <w:szCs w:val="24"/>
-                <w:lang w:eastAsia="zh-CN" w:bidi="ar"/>
-              </w:rPr>
-              <w:t>a</w:t>
-            </w:r>
-            <w:r>
-              <w:rPr>
-                <w:rFonts w:ascii="Times New Roman" w:eastAsia="SimSun" w:hAnsi="Times New Roman" w:cs="Times New Roman"/>
-                <w:color w:val="000000"/>
-                <w:sz w:val="24"/>
-                <w:szCs w:val="24"/>
-                <w:lang w:eastAsia="zh-CN" w:bidi="ar"/>
-              </w:rPr>
-              <w:t>y</w:t>
+              <w:t>Raghav Mulay</w:t>
             </w:r>
           </w:p>
         </w:tc>
@@ -2890,6 +2921,8 @@
             <w:r>
               <w:rPr>
                 <w:rFonts w:ascii="Times New Roman" w:hAnsi="Times New Roman" w:cs="Times New Roman"/>
+                <w:sz w:val="24"/>
+                <w:szCs w:val="24"/>
               </w:rPr>
               <w:t>29</w:t>
             </w:r>
@@ -2915,7 +2948,7 @@
                 <w:szCs w:val="24"/>
                 <w:lang w:eastAsia="zh-CN" w:bidi="ar"/>
               </w:rPr>
-              <w:t>12412144</w:t>
+              <w:t>12414013</w:t>
             </w:r>
           </w:p>
         </w:tc>
@@ -2965,7 +2998,7 @@
                 <w:szCs w:val="24"/>
                 <w:lang w:eastAsia="zh-CN" w:bidi="ar"/>
               </w:rPr>
-              <w:t>8767821081</w:t>
+              <w:t>8857953053</w:t>
             </w:r>
           </w:p>
         </w:tc>
@@ -2990,17 +3023,7 @@
                 <w:szCs w:val="24"/>
                 <w:lang w:eastAsia="zh-CN" w:bidi="ar"/>
               </w:rPr>
-              <w:t>abbasali.mustafa24</w:t>
-            </w:r>
-            <w:r>
-              <w:rPr>
-                <w:rFonts w:ascii="Times New Roman" w:eastAsia="SimSun" w:hAnsi="Times New Roman" w:cs="Times New Roman"/>
-                <w:color w:val="000000"/>
-                <w:sz w:val="24"/>
-                <w:szCs w:val="24"/>
-                <w:lang w:eastAsia="zh-CN" w:bidi="ar"/>
-              </w:rPr>
-              <w:t>@vit.edu</w:t>
+              <w:t>abbasali.mustafa24@vit.edu</w:t>
             </w:r>
           </w:p>
         </w:tc>
@@ -3025,6 +3048,8 @@
             <w:r>
               <w:rPr>
                 <w:rFonts w:ascii="Times New Roman" w:hAnsi="Times New Roman" w:cs="Times New Roman"/>
+                <w:sz w:val="24"/>
+                <w:szCs w:val="24"/>
               </w:rPr>
               <w:t>31</w:t>
             </w:r>
@@ -3050,17 +3075,7 @@
                 <w:szCs w:val="24"/>
                 <w:lang w:eastAsia="zh-CN" w:bidi="ar"/>
               </w:rPr>
-              <w:t>1241</w:t>
-            </w:r>
-            <w:r>
-              <w:rPr>
-                <w:rFonts w:ascii="Times New Roman" w:eastAsia="SimSun" w:hAnsi="Times New Roman" w:cs="Times New Roman"/>
-                <w:color w:val="000000"/>
-                <w:sz w:val="24"/>
-                <w:szCs w:val="24"/>
-                <w:lang w:eastAsia="zh-CN" w:bidi="ar"/>
-              </w:rPr>
-              <w:t>4910</w:t>
+              <w:t>12414910</w:t>
             </w:r>
           </w:p>
         </w:tc>
@@ -3135,17 +3150,7 @@
                 <w:szCs w:val="24"/>
                 <w:lang w:eastAsia="zh-CN" w:bidi="ar"/>
               </w:rPr>
-              <w:t>yashraj.nagargoje</w:t>
-            </w:r>
-            <w:r>
-              <w:rPr>
-                <w:rFonts w:ascii="Times New Roman" w:eastAsia="SimSun" w:hAnsi="Times New Roman" w:cs="Times New Roman"/>
-                <w:color w:val="000000"/>
-                <w:sz w:val="24"/>
-                <w:szCs w:val="24"/>
-                <w:lang w:eastAsia="zh-CN" w:bidi="ar"/>
-              </w:rPr>
-              <w:t>24@vit.edu</w:t>
+              <w:t>yashraj.nagargoje24@vit.edu</w:t>
             </w:r>
           </w:p>
         </w:tc>
@@ -3170,6 +3175,8 @@
             <w:r>
               <w:rPr>
                 <w:rFonts w:ascii="Times New Roman" w:hAnsi="Times New Roman" w:cs="Times New Roman"/>
+                <w:sz w:val="24"/>
+                <w:szCs w:val="24"/>
               </w:rPr>
               <w:t>32</w:t>
             </w:r>
@@ -3195,7 +3202,7 @@
                 <w:szCs w:val="24"/>
                 <w:lang w:eastAsia="zh-CN" w:bidi="ar"/>
               </w:rPr>
-              <w:t>12412077</w:t>
+              <w:t>12414737</w:t>
             </w:r>
           </w:p>
         </w:tc>
@@ -3245,7 +3252,7 @@
                 <w:szCs w:val="24"/>
                 <w:lang w:eastAsia="zh-CN" w:bidi="ar"/>
               </w:rPr>
-              <w:t>9028603262</w:t>
+              <w:t>7620721257</w:t>
             </w:r>
           </w:p>
         </w:tc>
@@ -4682,16 +4689,7 @@
           <w:sz w:val="28"/>
           <w:szCs w:val="28"/>
         </w:rPr>
-        <w:t>M</w:t>
-      </w:r>
-      <w:r>
-        <w:rPr>
-          <w:rFonts w:ascii="Times New Roman" w:hAnsi="Times New Roman" w:cs="Times New Roman"/>
-          <w:b/>
-          <w:sz w:val="28"/>
-          <w:szCs w:val="28"/>
-        </w:rPr>
-        <w:t>ain.cpp — Main Driver Program</w:t>
+        <w:t>Main.cpp — Main Driver Program</w:t>
       </w:r>
     </w:p>
     <w:p>
@@ -14249,27 +14247,7 @@
           <w:szCs w:val="24"/>
           <w:lang w:val="en-IN"/>
         </w:rPr>
-        <w:t xml:space="preserve"> &gt;&gt; </w:t>
-      </w:r>
-      <w:proofErr w:type="spellStart"/>
-      <w:r>
-        <w:rPr>
-          <w:rFonts w:ascii="Times New Roman" w:hAnsi="Times New Roman" w:cs="Times New Roman"/>
-          <w:sz w:val="24"/>
-          <w:szCs w:val="24"/>
-          <w:lang w:val="en-IN"/>
-        </w:rPr>
-        <w:t>ans</w:t>
-      </w:r>
-      <w:proofErr w:type="spellEnd"/>
-      <w:r>
-        <w:rPr>
-          <w:rFonts w:ascii="Times New Roman" w:hAnsi="Times New Roman" w:cs="Times New Roman"/>
-          <w:sz w:val="24"/>
-          <w:szCs w:val="24"/>
-          <w:lang w:val="en-IN"/>
-        </w:rPr>
-        <w:t>;</w:t>
+        <w:t xml:space="preserve"> &gt;&gt; ans;</w:t>
       </w:r>
     </w:p>
     <w:p>
@@ -24743,27 +24721,7 @@
           <w:szCs w:val="24"/>
           <w:lang w:val="en-IN"/>
         </w:rPr>
-        <w:t xml:space="preserve"> &gt;&gt; </w:t>
-      </w:r>
-      <w:proofErr w:type="spellStart"/>
-      <w:r>
-        <w:rPr>
-          <w:rFonts w:ascii="Times New Roman" w:hAnsi="Times New Roman" w:cs="Times New Roman"/>
-          <w:sz w:val="24"/>
-          <w:szCs w:val="24"/>
-          <w:lang w:val="en-IN"/>
-        </w:rPr>
-        <w:t>ans</w:t>
-      </w:r>
-      <w:proofErr w:type="spellEnd"/>
-      <w:r>
-        <w:rPr>
-          <w:rFonts w:ascii="Times New Roman" w:hAnsi="Times New Roman" w:cs="Times New Roman"/>
-          <w:sz w:val="24"/>
-          <w:szCs w:val="24"/>
-          <w:lang w:val="en-IN"/>
-        </w:rPr>
-        <w:t>;</w:t>
+        <w:t xml:space="preserve"> &gt;&gt; ans;</w:t>
       </w:r>
     </w:p>
     <w:p>
@@ -26104,6 +26062,7 @@
       <w:r>
         <w:rPr>
           <w:rFonts w:ascii="Times New Roman" w:hAnsi="Times New Roman" w:cs="Times New Roman"/>
+          <w:noProof/>
           <w:sz w:val="24"/>
           <w:szCs w:val="10"/>
         </w:rPr>
@@ -26168,6 +26127,7 @@
       <w:r>
         <w:rPr>
           <w:rFonts w:ascii="Times New Roman" w:hAnsi="Times New Roman" w:cs="Times New Roman"/>
+          <w:noProof/>
           <w:sz w:val="24"/>
           <w:szCs w:val="10"/>
         </w:rPr>
@@ -26232,6 +26192,7 @@
       <w:r>
         <w:rPr>
           <w:rFonts w:ascii="Times New Roman" w:hAnsi="Times New Roman" w:cs="Times New Roman"/>
+          <w:noProof/>
           <w:sz w:val="24"/>
           <w:szCs w:val="10"/>
         </w:rPr>
@@ -26294,6 +26255,7 @@
       <w:r>
         <w:rPr>
           <w:rFonts w:ascii="Times New Roman" w:hAnsi="Times New Roman" w:cs="Times New Roman"/>
+          <w:noProof/>
           <w:sz w:val="24"/>
           <w:szCs w:val="10"/>
         </w:rPr>
@@ -26483,6 +26445,7 @@
         <w:rPr>
           <w:rFonts w:ascii="Times New Roman" w:hAnsi="Times New Roman" w:cs="Times New Roman"/>
           <w:b/>
+          <w:noProof/>
           <w:sz w:val="40"/>
           <w:szCs w:val="18"/>
         </w:rPr>
@@ -26550,6 +26513,7 @@
         <w:rPr>
           <w:rFonts w:ascii="Times New Roman" w:hAnsi="Times New Roman" w:cs="Times New Roman"/>
           <w:b/>
+          <w:noProof/>
           <w:sz w:val="40"/>
           <w:szCs w:val="18"/>
         </w:rPr>
@@ -26617,6 +26581,7 @@
         <w:rPr>
           <w:rFonts w:ascii="Times New Roman" w:hAnsi="Times New Roman" w:cs="Times New Roman"/>
           <w:b/>
+          <w:noProof/>
           <w:sz w:val="40"/>
           <w:szCs w:val="18"/>
         </w:rPr>

</xml_diff>